<commit_message>
se agrego titulo de consigna 3
</commit_message>
<xml_diff>
--- a/TRABAJO PRÁCTICO INTEGRADOR I.docx2 - copia.docx
+++ b/TRABAJO PRÁCTICO INTEGRADOR I.docx2 - copia.docx
@@ -97,7 +97,7 @@
               </wp:anchor>
             </w:drawing>
           </mc:Choice>
-          <mc:Fallback xmlns:a="http://schemas.openxmlformats.org/drawingml/2006/main" xmlns:pic="http://schemas.openxmlformats.org/drawingml/2006/picture" xmlns:a14="http://schemas.microsoft.com/office/drawing/2010/main">
+          <mc:Fallback xmlns:a14="http://schemas.microsoft.com/office/drawing/2010/main" xmlns:pic="http://schemas.openxmlformats.org/drawingml/2006/picture" xmlns:a="http://schemas.openxmlformats.org/drawingml/2006/main">
             <w:pict w14:anchorId="7F58E1D6">
               <v:shapetype id="_x0000_t75" coordsize="21600,21600" filled="f" stroked="f" o:spt="75" o:preferrelative="t" path="m@4@5l@4@11@9@11@9@5xe" w14:anchorId="4889370A">
                 <v:stroke joinstyle="miter"/>
@@ -234,7 +234,7 @@
               </wp:anchor>
             </w:drawing>
           </mc:Choice>
-          <mc:Fallback xmlns:a="http://schemas.openxmlformats.org/drawingml/2006/main" xmlns:pic="http://schemas.openxmlformats.org/drawingml/2006/picture" xmlns:a14="http://schemas.microsoft.com/office/drawing/2010/main">
+          <mc:Fallback xmlns:a14="http://schemas.microsoft.com/office/drawing/2010/main" xmlns:pic="http://schemas.openxmlformats.org/drawingml/2006/picture" xmlns:a="http://schemas.openxmlformats.org/drawingml/2006/main">
             <w:pict w14:anchorId="6B501C6C">
               <v:oval id="Elipse 7" style="position:absolute;margin-left:-37.05pt;margin-top:23.55pt;width:156.75pt;height:105.75pt;z-index:-251656192;visibility:visible;mso-wrap-style:square;mso-width-percent:0;mso-height-percent:0;mso-wrap-distance-left:9pt;mso-wrap-distance-top:0;mso-wrap-distance-right:9pt;mso-wrap-distance-bottom:0;mso-position-horizontal:absolute;mso-position-horizontal-relative:margin;mso-position-vertical:absolute;mso-position-vertical-relative:text;mso-width-percent:0;mso-height-percent:0;mso-width-relative:margin;mso-height-relative:margin;v-text-anchor:middle" o:spid="_x0000_s1026" fillcolor="white [3201]" strokecolor="black [3200]" strokeweight="1pt" w14:anchorId="516D7331" o:gfxdata="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">
                 <v:stroke joinstyle="miter"/>
@@ -418,7 +418,7 @@
               </wp:anchor>
             </w:drawing>
           </mc:Choice>
-          <mc:Fallback xmlns:a="http://schemas.openxmlformats.org/drawingml/2006/main" xmlns:pic="http://schemas.openxmlformats.org/drawingml/2006/picture" xmlns:a14="http://schemas.microsoft.com/office/drawing/2010/main">
+          <mc:Fallback xmlns:a14="http://schemas.microsoft.com/office/drawing/2010/main" xmlns:pic="http://schemas.openxmlformats.org/drawingml/2006/picture" xmlns:a="http://schemas.openxmlformats.org/drawingml/2006/main">
             <w:pict w14:anchorId="7FC305C7">
               <v:oval id="Elipse 8" style="position:absolute;margin-left:52.2pt;margin-top:1.05pt;width:160.5pt;height:105.75pt;z-index:251661312;visibility:visible;mso-wrap-style:square;mso-width-percent:0;mso-height-percent:0;mso-wrap-distance-left:9pt;mso-wrap-distance-top:0;mso-wrap-distance-right:9pt;mso-wrap-distance-bottom:0;mso-position-horizontal:absolute;mso-position-horizontal-relative:text;mso-position-vertical:absolute;mso-position-vertical-relative:text;mso-width-percent:0;mso-height-percent:0;mso-width-relative:margin;mso-height-relative:margin;v-text-anchor:middle" o:spid="_x0000_s1026" filled="f" strokecolor="black [3200]" strokeweight="1pt" w14:anchorId="19A77092" o:gfxdata="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">
                 <v:stroke joinstyle="miter"/>
@@ -550,7 +550,7 @@
               </wp:anchor>
             </w:drawing>
           </mc:Choice>
-          <mc:Fallback xmlns:a="http://schemas.openxmlformats.org/drawingml/2006/main" xmlns:pic="http://schemas.openxmlformats.org/drawingml/2006/picture" xmlns:a14="http://schemas.microsoft.com/office/drawing/2010/main">
+          <mc:Fallback xmlns:a14="http://schemas.microsoft.com/office/drawing/2010/main" xmlns:pic="http://schemas.openxmlformats.org/drawingml/2006/picture" xmlns:a="http://schemas.openxmlformats.org/drawingml/2006/main">
             <w:pict w14:anchorId="528BD50E">
               <v:oval id="Elipse 11" style="position:absolute;margin-left:-45.3pt;margin-top:27.3pt;width:169.5pt;height:96.75pt;z-index:251663360;visibility:visible;mso-wrap-style:square;mso-width-percent:0;mso-height-percent:0;mso-wrap-distance-left:9pt;mso-wrap-distance-top:0;mso-wrap-distance-right:9pt;mso-wrap-distance-bottom:0;mso-position-horizontal:absolute;mso-position-horizontal-relative:text;mso-position-vertical:absolute;mso-position-vertical-relative:text;mso-width-percent:0;mso-height-percent:0;mso-width-relative:margin;mso-height-relative:margin;v-text-anchor:middle" o:spid="_x0000_s1026" fillcolor="white [3201]" strokecolor="black [3200]" strokeweight="1pt" w14:anchorId="70E191BE" o:gfxdata="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">
                 <v:stroke joinstyle="miter"/>
@@ -886,7 +886,7 @@
               </wp:anchor>
             </w:drawing>
           </mc:Choice>
-          <mc:Fallback xmlns:a="http://schemas.openxmlformats.org/drawingml/2006/main" xmlns:pic="http://schemas.openxmlformats.org/drawingml/2006/picture" xmlns:a14="http://schemas.microsoft.com/office/drawing/2010/main">
+          <mc:Fallback xmlns:a14="http://schemas.microsoft.com/office/drawing/2010/main" xmlns:pic="http://schemas.openxmlformats.org/drawingml/2006/picture" xmlns:a="http://schemas.openxmlformats.org/drawingml/2006/main">
             <w:pict w14:anchorId="17EA24D0">
               <v:oval id="Elipse 12" style="position:absolute;margin-left:70.95pt;margin-top:1.8pt;width:171pt;height:96pt;z-index:251664384;visibility:visible;mso-wrap-style:square;mso-width-percent:0;mso-height-percent:0;mso-wrap-distance-left:9pt;mso-wrap-distance-top:0;mso-wrap-distance-right:9pt;mso-wrap-distance-bottom:0;mso-position-horizontal:absolute;mso-position-horizontal-relative:text;mso-position-vertical:absolute;mso-position-vertical-relative:text;mso-width-percent:0;mso-height-percent:0;mso-width-relative:margin;mso-height-relative:margin;v-text-anchor:middle" o:spid="_x0000_s1026" filled="f" strokecolor="black [3200]" strokeweight="1pt" w14:anchorId="7B3AB5DF" o:gfxdata="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">
                 <v:stroke joinstyle="miter"/>
@@ -1025,7 +1025,15 @@
         </w:tabs>
       </w:pPr>
       <w:r>
-        <w:t>Usuarios que usan la plataforma pero no presentan errores: [101, 103, 104, 106, 107, 108]</w:t>
+        <w:t xml:space="preserve">Usuarios que usan la </w:t>
+      </w:r>
+      <w:proofErr w:type="gramStart"/>
+      <w:r>
+        <w:t>plataforma</w:t>
+      </w:r>
+      <w:proofErr w:type="gramEnd"/>
+      <w:r>
+        <w:t xml:space="preserve"> pero no presentan errores: [101, 103, 104, 106, 107, 108]</w:t>
       </w:r>
     </w:p>
     <w:p>
@@ -1447,7 +1455,7 @@
               </wp:anchor>
             </w:drawing>
           </mc:Choice>
-          <mc:Fallback xmlns:a="http://schemas.openxmlformats.org/drawingml/2006/main" xmlns:pic="http://schemas.openxmlformats.org/drawingml/2006/picture" xmlns:a14="http://schemas.microsoft.com/office/drawing/2010/main">
+          <mc:Fallback xmlns:a14="http://schemas.microsoft.com/office/drawing/2010/main" xmlns:pic="http://schemas.openxmlformats.org/drawingml/2006/picture" xmlns:a="http://schemas.openxmlformats.org/drawingml/2006/main">
             <w:pict w14:anchorId="5B4AA261">
               <v:oval id="Elipse 16" style="position:absolute;margin-left:1.2pt;margin-top:1.1pt;width:168.75pt;height:84.75pt;z-index:251668480;visibility:visible;mso-wrap-style:square;mso-height-percent:0;mso-wrap-distance-left:9pt;mso-wrap-distance-top:0;mso-wrap-distance-right:9pt;mso-wrap-distance-bottom:0;mso-position-horizontal:absolute;mso-position-horizontal-relative:text;mso-position-vertical:absolute;mso-position-vertical-relative:text;mso-height-percent:0;mso-height-relative:margin;v-text-anchor:middle" o:spid="_x0000_s1026" fillcolor="white [3201]" strokecolor="black [3200]" strokeweight="1pt" w14:anchorId="67BC458A" o:gfxdata="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">
                 <v:stroke joinstyle="miter"/>
@@ -1522,7 +1530,7 @@
               </wp:anchor>
             </w:drawing>
           </mc:Choice>
-          <mc:Fallback xmlns:a="http://schemas.openxmlformats.org/drawingml/2006/main" xmlns:pic="http://schemas.openxmlformats.org/drawingml/2006/picture" xmlns:a14="http://schemas.microsoft.com/office/drawing/2010/main">
+          <mc:Fallback xmlns:a14="http://schemas.microsoft.com/office/drawing/2010/main" xmlns:pic="http://schemas.openxmlformats.org/drawingml/2006/picture" xmlns:a="http://schemas.openxmlformats.org/drawingml/2006/main">
             <w:pict w14:anchorId="21D04EF8">
               <v:oval id="Elipse 17" style="position:absolute;margin-left:121.2pt;margin-top:1.1pt;width:165pt;height:82.5pt;z-index:251669504;visibility:visible;mso-wrap-style:square;mso-width-percent:0;mso-height-percent:0;mso-wrap-distance-left:9pt;mso-wrap-distance-top:0;mso-wrap-distance-right:9pt;mso-wrap-distance-bottom:0;mso-position-horizontal:absolute;mso-position-horizontal-relative:margin;mso-position-vertical:absolute;mso-position-vertical-relative:text;mso-width-percent:0;mso-height-percent:0;mso-width-relative:margin;mso-height-relative:margin;v-text-anchor:middle" o:spid="_x0000_s1026" filled="f" strokecolor="black [3200]" strokeweight="1pt" w14:anchorId="23313D76" o:gfxdata="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">
                 <v:stroke joinstyle="miter"/>
@@ -1912,7 +1920,7 @@
               </wp:anchor>
             </w:drawing>
           </mc:Choice>
-          <mc:Fallback xmlns:a="http://schemas.openxmlformats.org/drawingml/2006/main" xmlns:pic="http://schemas.openxmlformats.org/drawingml/2006/picture" xmlns:a14="http://schemas.microsoft.com/office/drawing/2010/main">
+          <mc:Fallback xmlns:a14="http://schemas.microsoft.com/office/drawing/2010/main" xmlns:pic="http://schemas.openxmlformats.org/drawingml/2006/picture" xmlns:a="http://schemas.openxmlformats.org/drawingml/2006/main">
             <w:pict w14:anchorId="24D63367">
               <v:oval id="Elipse 22" style="position:absolute;margin-left:83.7pt;margin-top:-45.35pt;width:183.75pt;height:80.25pt;z-index:251674624;visibility:visible;mso-wrap-style:square;mso-width-percent:0;mso-height-percent:0;mso-wrap-distance-left:9pt;mso-wrap-distance-top:0;mso-wrap-distance-right:9pt;mso-wrap-distance-bottom:0;mso-position-horizontal:absolute;mso-position-horizontal-relative:text;mso-position-vertical:absolute;mso-position-vertical-relative:text;mso-width-percent:0;mso-height-percent:0;mso-width-relative:margin;mso-height-relative:margin;v-text-anchor:middle" o:spid="_x0000_s1026" filled="f" strokecolor="black [3200]" strokeweight="1pt" w14:anchorId="337004C8" o:gfxdata="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">
                 <v:stroke joinstyle="miter"/>
@@ -1983,7 +1991,7 @@
               </wp:anchor>
             </w:drawing>
           </mc:Choice>
-          <mc:Fallback xmlns:a="http://schemas.openxmlformats.org/drawingml/2006/main" xmlns:pic="http://schemas.openxmlformats.org/drawingml/2006/picture" xmlns:a14="http://schemas.microsoft.com/office/drawing/2010/main">
+          <mc:Fallback xmlns:a14="http://schemas.microsoft.com/office/drawing/2010/main" xmlns:pic="http://schemas.openxmlformats.org/drawingml/2006/picture" xmlns:a="http://schemas.openxmlformats.org/drawingml/2006/main">
             <w:pict w14:anchorId="08B699C7">
               <v:oval id="Elipse 21" style="position:absolute;margin-left:-44.55pt;margin-top:-45.35pt;width:183.75pt;height:83.25pt;z-index:251673600;visibility:visible;mso-wrap-style:square;mso-height-percent:0;mso-wrap-distance-left:9pt;mso-wrap-distance-top:0;mso-wrap-distance-right:9pt;mso-wrap-distance-bottom:0;mso-position-horizontal:absolute;mso-position-horizontal-relative:text;mso-position-vertical:absolute;mso-position-vertical-relative:text;mso-height-percent:0;mso-height-relative:margin;v-text-anchor:middle" o:spid="_x0000_s1026" fillcolor="white [3201]" strokecolor="black [3200]" strokeweight="1pt" w14:anchorId="7AEFD189" o:gfxdata="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">
                 <v:stroke joinstyle="miter"/>
@@ -2069,7 +2077,7 @@
               </wp:anchor>
             </w:drawing>
           </mc:Choice>
-          <mc:Fallback xmlns:a="http://schemas.openxmlformats.org/drawingml/2006/main" xmlns:pic="http://schemas.openxmlformats.org/drawingml/2006/picture" xmlns:a14="http://schemas.microsoft.com/office/drawing/2010/main">
+          <mc:Fallback xmlns:a14="http://schemas.microsoft.com/office/drawing/2010/main" xmlns:pic="http://schemas.openxmlformats.org/drawingml/2006/picture" xmlns:a="http://schemas.openxmlformats.org/drawingml/2006/main">
             <w:pict w14:anchorId="4D67F105">
               <v:oval id="Elipse 26" style="position:absolute;margin-left:85.95pt;margin-top:19.15pt;width:151.5pt;height:65.25pt;z-index:251678720;visibility:visible;mso-wrap-style:square;mso-width-percent:0;mso-wrap-distance-left:9pt;mso-wrap-distance-top:0;mso-wrap-distance-right:9pt;mso-wrap-distance-bottom:0;mso-position-horizontal:absolute;mso-position-horizontal-relative:text;mso-position-vertical:absolute;mso-position-vertical-relative:text;mso-width-percent:0;mso-width-relative:margin;v-text-anchor:middle" o:spid="_x0000_s1026" filled="f" strokecolor="black [3200]" strokeweight="1pt" w14:anchorId="56480DA1" o:gfxdata="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">
                 <v:stroke joinstyle="miter"/>
@@ -2137,7 +2145,7 @@
               </wp:anchor>
             </w:drawing>
           </mc:Choice>
-          <mc:Fallback xmlns:a="http://schemas.openxmlformats.org/drawingml/2006/main" xmlns:pic="http://schemas.openxmlformats.org/drawingml/2006/picture" xmlns:a14="http://schemas.microsoft.com/office/drawing/2010/main">
+          <mc:Fallback xmlns:a14="http://schemas.microsoft.com/office/drawing/2010/main" xmlns:pic="http://schemas.openxmlformats.org/drawingml/2006/picture" xmlns:a="http://schemas.openxmlformats.org/drawingml/2006/main">
             <w:pict w14:anchorId="2D4F6D4C">
               <v:oval id="Elipse 25" style="position:absolute;margin-left:-26.55pt;margin-top:17.65pt;width:155.25pt;height:69.75pt;z-index:251677696;visibility:visible;mso-wrap-style:square;mso-wrap-distance-left:9pt;mso-wrap-distance-top:0;mso-wrap-distance-right:9pt;mso-wrap-distance-bottom:0;mso-position-horizontal:absolute;mso-position-horizontal-relative:text;mso-position-vertical:absolute;mso-position-vertical-relative:text;v-text-anchor:middle" o:spid="_x0000_s1026" fillcolor="white [3201]" strokecolor="black [3200]" strokeweight="1pt" w14:anchorId="46AE126A" o:gfxdata="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">
                 <v:stroke joinstyle="miter"/>
@@ -2147,7 +2155,15 @@
         </mc:AlternateContent>
       </w:r>
       <w:r>
-        <w:t xml:space="preserve">Usuarios que están en C pero no en A </w:t>
+        <w:t xml:space="preserve">Usuarios que están en </w:t>
+      </w:r>
+      <w:proofErr w:type="gramStart"/>
+      <w:r>
+        <w:t>C</w:t>
+      </w:r>
+      <w:proofErr w:type="gramEnd"/>
+      <w:r>
+        <w:t xml:space="preserve"> pero no en A </w:t>
       </w:r>
       <w:r>
         <w:rPr>
@@ -2235,7 +2251,7 @@
               </wp:anchor>
             </w:drawing>
           </mc:Choice>
-          <mc:Fallback xmlns:a="http://schemas.openxmlformats.org/drawingml/2006/main" xmlns:pic="http://schemas.openxmlformats.org/drawingml/2006/picture" xmlns:a14="http://schemas.microsoft.com/office/drawing/2010/main">
+          <mc:Fallback xmlns:a14="http://schemas.microsoft.com/office/drawing/2010/main" xmlns:pic="http://schemas.openxmlformats.org/drawingml/2006/picture" xmlns:a="http://schemas.openxmlformats.org/drawingml/2006/main">
             <w:pict w14:anchorId="422F000A">
               <v:oval id="Elipse 27" style="position:absolute;margin-left:43.95pt;margin-top:10.2pt;width:137.25pt;height:80.25pt;z-index:251679744;visibility:visible;mso-wrap-style:square;mso-width-percent:0;mso-wrap-distance-left:9pt;mso-wrap-distance-top:0;mso-wrap-distance-right:9pt;mso-wrap-distance-bottom:0;mso-position-horizontal:absolute;mso-position-horizontal-relative:text;mso-position-vertical:absolute;mso-position-vertical-relative:text;mso-width-percent:0;mso-width-relative:margin;v-text-anchor:middle" o:spid="_x0000_s1026" filled="f" strokecolor="black [3200]" strokeweight="1pt" w14:anchorId="6414197D" o:gfxdata="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">
                 <v:stroke joinstyle="miter"/>
@@ -2447,7 +2463,7 @@
               </wp:anchor>
             </w:drawing>
           </mc:Choice>
-          <mc:Fallback xmlns:a="http://schemas.openxmlformats.org/drawingml/2006/main" xmlns:pic="http://schemas.openxmlformats.org/drawingml/2006/picture" xmlns:a14="http://schemas.microsoft.com/office/drawing/2010/main">
+          <mc:Fallback xmlns:a14="http://schemas.microsoft.com/office/drawing/2010/main" xmlns:pic="http://schemas.openxmlformats.org/drawingml/2006/picture" xmlns:a="http://schemas.openxmlformats.org/drawingml/2006/main">
             <w:pict w14:anchorId="58DB842E">
               <v:oval id="Elipse 29" style="position:absolute;margin-left:24.45pt;margin-top:16.25pt;width:99pt;height:75pt;z-index:251681792;visibility:visible;mso-wrap-style:square;mso-height-percent:0;mso-wrap-distance-left:9pt;mso-wrap-distance-top:0;mso-wrap-distance-right:9pt;mso-wrap-distance-bottom:0;mso-position-horizontal:absolute;mso-position-horizontal-relative:text;mso-position-vertical:absolute;mso-position-vertical-relative:text;mso-height-percent:0;mso-height-relative:margin;v-text-anchor:middle" o:spid="_x0000_s1026" fillcolor="white [3201]" strokecolor="black [3200]" strokeweight="1pt" w14:anchorId="6FFA33F0" o:gfxdata="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">
                 <v:stroke joinstyle="miter"/>
@@ -2519,7 +2535,7 @@
               </wp:anchor>
             </w:drawing>
           </mc:Choice>
-          <mc:Fallback xmlns:a="http://schemas.openxmlformats.org/drawingml/2006/main" xmlns:pic="http://schemas.openxmlformats.org/drawingml/2006/picture" xmlns:a14="http://schemas.microsoft.com/office/drawing/2010/main">
+          <mc:Fallback xmlns:a14="http://schemas.microsoft.com/office/drawing/2010/main" xmlns:pic="http://schemas.openxmlformats.org/drawingml/2006/picture" xmlns:a="http://schemas.openxmlformats.org/drawingml/2006/main">
             <w:pict w14:anchorId="4388CAE9">
               <v:oval id="Elipse 30" style="position:absolute;margin-left:92.7pt;margin-top:16.25pt;width:99pt;height:75.75pt;z-index:251682816;visibility:visible;mso-wrap-style:square;mso-height-percent:0;mso-wrap-distance-left:9pt;mso-wrap-distance-top:0;mso-wrap-distance-right:9pt;mso-wrap-distance-bottom:0;mso-position-horizontal:absolute;mso-position-horizontal-relative:text;mso-position-vertical:absolute;mso-position-vertical-relative:text;mso-height-percent:0;mso-height-relative:margin;v-text-anchor:middle" o:spid="_x0000_s1026" filled="f" strokecolor="black [3200]" strokeweight="1pt" w14:anchorId="07AA4FA5" o:gfxdata="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">
                 <v:stroke joinstyle="miter"/>
@@ -2637,19 +2653,11 @@
                           <w:lang w:val="es-ES"/>
                         </w:rPr>
                       </w:pPr>
-                      <w:proofErr w:type="gramStart"/>
                       <w:r>
                         <w:rPr>
                           <w:lang w:val="es-ES"/>
                         </w:rPr>
-                        <w:t>104  105</w:t>
-                      </w:r>
-                      <w:proofErr w:type="gramEnd"/>
-                      <w:r>
-                        <w:rPr>
-                          <w:lang w:val="es-ES"/>
-                        </w:rPr>
-                        <w:t xml:space="preserve"> 106</w:t>
+                        <w:t>104  105 106</w:t>
                       </w:r>
                     </w:p>
                     <w:p>
@@ -2904,7 +2912,7 @@
               </wp:anchor>
             </w:drawing>
           </mc:Choice>
-          <mc:Fallback xmlns:a="http://schemas.openxmlformats.org/drawingml/2006/main" xmlns:pic="http://schemas.openxmlformats.org/drawingml/2006/picture" xmlns:a14="http://schemas.microsoft.com/office/drawing/2010/main">
+          <mc:Fallback xmlns:a14="http://schemas.microsoft.com/office/drawing/2010/main" xmlns:pic="http://schemas.openxmlformats.org/drawingml/2006/picture" xmlns:a="http://schemas.openxmlformats.org/drawingml/2006/main">
             <w:pict w14:anchorId="36749921">
               <v:oval id="Elipse 33" style="position:absolute;margin-left:93.45pt;margin-top:8.05pt;width:114pt;height:79.5pt;z-index:251685888;visibility:visible;mso-wrap-style:square;mso-width-percent:0;mso-height-percent:0;mso-wrap-distance-left:9pt;mso-wrap-distance-top:0;mso-wrap-distance-right:9pt;mso-wrap-distance-bottom:0;mso-position-horizontal:absolute;mso-position-horizontal-relative:text;mso-position-vertical:absolute;mso-position-vertical-relative:text;mso-width-percent:0;mso-height-percent:0;mso-width-relative:margin;mso-height-relative:margin;v-text-anchor:middle" o:spid="_x0000_s1026" filled="f" strokecolor="black [3200]" strokeweight="1pt" w14:anchorId="41AB1401" o:gfxdata="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">
                 <v:stroke joinstyle="miter"/>
@@ -2972,7 +2980,7 @@
               </wp:anchor>
             </w:drawing>
           </mc:Choice>
-          <mc:Fallback xmlns:a="http://schemas.openxmlformats.org/drawingml/2006/main" xmlns:pic="http://schemas.openxmlformats.org/drawingml/2006/picture" xmlns:a14="http://schemas.microsoft.com/office/drawing/2010/main">
+          <mc:Fallback xmlns:a14="http://schemas.microsoft.com/office/drawing/2010/main" xmlns:pic="http://schemas.openxmlformats.org/drawingml/2006/picture" xmlns:a="http://schemas.openxmlformats.org/drawingml/2006/main">
             <w:pict w14:anchorId="6392F7F2">
               <v:oval id="Elipse 32" style="position:absolute;margin-left:30.45pt;margin-top:7.3pt;width:121.5pt;height:79.5pt;z-index:251684864;visibility:visible;mso-wrap-style:square;mso-wrap-distance-left:9pt;mso-wrap-distance-top:0;mso-wrap-distance-right:9pt;mso-wrap-distance-bottom:0;mso-position-horizontal:absolute;mso-position-horizontal-relative:text;mso-position-vertical:absolute;mso-position-vertical-relative:text;v-text-anchor:middle" o:spid="_x0000_s1026" fillcolor="white [3201]" strokecolor="black [3200]" strokeweight="1pt" w14:anchorId="76C6AC11" o:gfxdata="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">
                 <v:stroke joinstyle="miter"/>
@@ -3358,6 +3366,7 @@
               </w:rPr>
               <w:t>∨</w:t>
             </w:r>
+            <w:proofErr w:type="gramStart"/>
             <w:r>
               <w:rPr>
                 <w:highlight w:val="yellow"/>
@@ -3378,6 +3387,7 @@
               </w:rPr>
               <w:t>∧</w:t>
             </w:r>
+            <w:proofErr w:type="gramEnd"/>
             <w:r>
               <w:rPr>
                 <w:highlight w:val="yellow"/>
@@ -4278,6 +4288,7 @@
         <w:t xml:space="preserve"> </w:t>
       </w:r>
       <w:proofErr w:type="spellStart"/>
+      <w:proofErr w:type="gramStart"/>
       <w:r>
         <w:rPr>
           <w:rStyle w:val="m"/>
@@ -4288,6 +4299,7 @@
       <w:r>
         <w:t>(</w:t>
       </w:r>
+      <w:proofErr w:type="gramEnd"/>
       <w:r>
         <w:rPr>
           <w:rStyle w:val="j"/>
@@ -4554,6 +4566,7 @@
         <w:t xml:space="preserve">              </w:t>
       </w:r>
       <w:proofErr w:type="spellStart"/>
+      <w:proofErr w:type="gramStart"/>
       <w:r>
         <w:rPr>
           <w:rStyle w:val="m"/>
@@ -4564,6 +4577,7 @@
       <w:r>
         <w:t>(</w:t>
       </w:r>
+      <w:proofErr w:type="gramEnd"/>
       <w:r>
         <w:rPr>
           <w:rStyle w:val="m"/>
@@ -4612,6 +4626,7 @@
         <w:t xml:space="preserve">             </w:t>
       </w:r>
       <w:proofErr w:type="spellStart"/>
+      <w:proofErr w:type="gramStart"/>
       <w:r>
         <w:rPr>
           <w:rStyle w:val="m"/>
@@ -4622,6 +4637,7 @@
       <w:r>
         <w:t>(</w:t>
       </w:r>
+      <w:proofErr w:type="gramEnd"/>
       <w:r>
         <w:rPr>
           <w:rStyle w:val="m"/>
@@ -4807,6 +4823,7 @@
         <w:t xml:space="preserve"> i in </w:t>
       </w:r>
       <w:proofErr w:type="spellStart"/>
+      <w:proofErr w:type="gramStart"/>
       <w:r>
         <w:rPr>
           <w:rFonts w:eastAsia="Times New Roman" w:cstheme="minorHAnsi"/>
@@ -4828,7 +4845,19 @@
           <w:lang w:eastAsia="es-AR"/>
           <w14:ligatures w14:val="none"/>
         </w:rPr>
-        <w:t>(9):</w:t>
+        <w:t>(</w:t>
+      </w:r>
+      <w:proofErr w:type="gramEnd"/>
+      <w:r>
+        <w:rPr>
+          <w:rFonts w:eastAsia="Times New Roman" w:cstheme="minorHAnsi"/>
+          <w:kern w:val="0"/>
+          <w:sz w:val="24"/>
+          <w:szCs w:val="24"/>
+          <w:lang w:eastAsia="es-AR"/>
+          <w14:ligatures w14:val="none"/>
+        </w:rPr>
+        <w:t>9):</w:t>
       </w:r>
     </w:p>
     <w:p>
@@ -5720,7 +5749,23 @@
           <w:sz w:val="24"/>
           <w:szCs w:val="24"/>
         </w:rPr>
-        <w:t>Los usuarios críticos son los que usan alguna plataforma y además generan errores. Representan mayor riesgo porque pueden afectar el funcionamiento del sistema. El usuario 109 aparece en C pero no en A ni B, por lo que puede ser un error de registro o un acceso externo. Como equipo programador revisaríamos los logs y agregaríamos más validaciones.</w:t>
+        <w:t xml:space="preserve">Los usuarios críticos son los que usan alguna plataforma y además generan errores. Representan mayor riesgo porque pueden afectar el funcionamiento del sistema. El usuario 109 aparece en </w:t>
+      </w:r>
+      <w:proofErr w:type="gramStart"/>
+      <w:r>
+        <w:rPr>
+          <w:sz w:val="24"/>
+          <w:szCs w:val="24"/>
+        </w:rPr>
+        <w:t>C</w:t>
+      </w:r>
+      <w:proofErr w:type="gramEnd"/>
+      <w:r>
+        <w:rPr>
+          <w:sz w:val="24"/>
+          <w:szCs w:val="24"/>
+        </w:rPr>
+        <w:t xml:space="preserve"> pero no en A ni B, por lo que puede ser un error de registro o un acceso externo. Como equipo programador revisaríamos los logs y agregaríamos más validaciones.</w:t>
       </w:r>
     </w:p>
     <w:p>
@@ -6422,7 +6467,31 @@
           <w:lang w:eastAsia="es-AR"/>
           <w14:ligatures w14:val="none"/>
         </w:rPr>
-        <w:t>A=40(5)+200</w:t>
+        <w:t>A=40(</w:t>
+      </w:r>
+      <w:proofErr w:type="gramStart"/>
+      <w:r>
+        <w:rPr>
+          <w:rFonts w:eastAsia="Times New Roman" w:cstheme="minorHAnsi"/>
+          <w:kern w:val="0"/>
+          <w:sz w:val="24"/>
+          <w:szCs w:val="24"/>
+          <w:lang w:eastAsia="es-AR"/>
+          <w14:ligatures w14:val="none"/>
+        </w:rPr>
+        <w:t>5)+</w:t>
+      </w:r>
+      <w:proofErr w:type="gramEnd"/>
+      <w:r>
+        <w:rPr>
+          <w:rFonts w:eastAsia="Times New Roman" w:cstheme="minorHAnsi"/>
+          <w:kern w:val="0"/>
+          <w:sz w:val="24"/>
+          <w:szCs w:val="24"/>
+          <w:lang w:eastAsia="es-AR"/>
+          <w14:ligatures w14:val="none"/>
+        </w:rPr>
+        <w:t>200</w:t>
       </w:r>
     </w:p>
     <w:p>
@@ -6522,7 +6591,31 @@
           <w:lang w:eastAsia="es-AR"/>
           <w14:ligatures w14:val="none"/>
         </w:rPr>
-        <w:t>(5 , 400)</w:t>
+        <w:t>(</w:t>
+      </w:r>
+      <w:proofErr w:type="gramStart"/>
+      <w:r>
+        <w:rPr>
+          <w:rFonts w:eastAsia="Times New Roman" w:cstheme="minorHAnsi"/>
+          <w:kern w:val="0"/>
+          <w:sz w:val="24"/>
+          <w:szCs w:val="24"/>
+          <w:lang w:eastAsia="es-AR"/>
+          <w14:ligatures w14:val="none"/>
+        </w:rPr>
+        <w:t>5 ,</w:t>
+      </w:r>
+      <w:proofErr w:type="gramEnd"/>
+      <w:r>
+        <w:rPr>
+          <w:rFonts w:eastAsia="Times New Roman" w:cstheme="minorHAnsi"/>
+          <w:kern w:val="0"/>
+          <w:sz w:val="24"/>
+          <w:szCs w:val="24"/>
+          <w:lang w:eastAsia="es-AR"/>
+          <w14:ligatures w14:val="none"/>
+        </w:rPr>
+        <w:t xml:space="preserve"> 400)</w:t>
       </w:r>
     </w:p>
     <w:p>
@@ -6697,7 +6790,55 @@
           <w:lang w:eastAsia="es-AR"/>
           <w14:ligatures w14:val="none"/>
         </w:rPr>
-        <w:t>C=−2(20²)+80(20)+100</w:t>
+        <w:t>C=−2(20</w:t>
+      </w:r>
+      <w:proofErr w:type="gramStart"/>
+      <w:r>
+        <w:rPr>
+          <w:rFonts w:eastAsia="Times New Roman" w:cstheme="minorHAnsi"/>
+          <w:kern w:val="0"/>
+          <w:sz w:val="24"/>
+          <w:szCs w:val="24"/>
+          <w:lang w:eastAsia="es-AR"/>
+          <w14:ligatures w14:val="none"/>
+        </w:rPr>
+        <w:t>²)+</w:t>
+      </w:r>
+      <w:proofErr w:type="gramEnd"/>
+      <w:r>
+        <w:rPr>
+          <w:rFonts w:eastAsia="Times New Roman" w:cstheme="minorHAnsi"/>
+          <w:kern w:val="0"/>
+          <w:sz w:val="24"/>
+          <w:szCs w:val="24"/>
+          <w:lang w:eastAsia="es-AR"/>
+          <w14:ligatures w14:val="none"/>
+        </w:rPr>
+        <w:t>80(</w:t>
+      </w:r>
+      <w:proofErr w:type="gramStart"/>
+      <w:r>
+        <w:rPr>
+          <w:rFonts w:eastAsia="Times New Roman" w:cstheme="minorHAnsi"/>
+          <w:kern w:val="0"/>
+          <w:sz w:val="24"/>
+          <w:szCs w:val="24"/>
+          <w:lang w:eastAsia="es-AR"/>
+          <w14:ligatures w14:val="none"/>
+        </w:rPr>
+        <w:t>20)+</w:t>
+      </w:r>
+      <w:proofErr w:type="gramEnd"/>
+      <w:r>
+        <w:rPr>
+          <w:rFonts w:eastAsia="Times New Roman" w:cstheme="minorHAnsi"/>
+          <w:kern w:val="0"/>
+          <w:sz w:val="24"/>
+          <w:szCs w:val="24"/>
+          <w:lang w:eastAsia="es-AR"/>
+          <w14:ligatures w14:val="none"/>
+        </w:rPr>
+        <w:t>100</w:t>
       </w:r>
     </w:p>
     <w:p>
@@ -6722,7 +6863,31 @@
           <w:lang w:eastAsia="es-AR"/>
           <w14:ligatures w14:val="none"/>
         </w:rPr>
-        <w:t>C=−2(400)+1600+100</w:t>
+        <w:t>C=−2(</w:t>
+      </w:r>
+      <w:proofErr w:type="gramStart"/>
+      <w:r>
+        <w:rPr>
+          <w:rFonts w:eastAsia="Times New Roman" w:cstheme="minorHAnsi"/>
+          <w:kern w:val="0"/>
+          <w:sz w:val="24"/>
+          <w:szCs w:val="24"/>
+          <w:lang w:eastAsia="es-AR"/>
+          <w14:ligatures w14:val="none"/>
+        </w:rPr>
+        <w:t>400)+</w:t>
+      </w:r>
+      <w:proofErr w:type="gramEnd"/>
+      <w:r>
+        <w:rPr>
+          <w:rFonts w:eastAsia="Times New Roman" w:cstheme="minorHAnsi"/>
+          <w:kern w:val="0"/>
+          <w:sz w:val="24"/>
+          <w:szCs w:val="24"/>
+          <w:lang w:eastAsia="es-AR"/>
+          <w14:ligatures w14:val="none"/>
+        </w:rPr>
+        <w:t>1600+100</w:t>
       </w:r>
     </w:p>
     <w:p>
@@ -6835,7 +7000,31 @@
           <w:lang w:eastAsia="es-AR"/>
           <w14:ligatures w14:val="none"/>
         </w:rPr>
-        <w:t xml:space="preserve"> (20 , 900)</w:t>
+        <w:t xml:space="preserve"> (</w:t>
+      </w:r>
+      <w:proofErr w:type="gramStart"/>
+      <w:r>
+        <w:rPr>
+          <w:rFonts w:eastAsia="Times New Roman" w:cstheme="minorHAnsi"/>
+          <w:kern w:val="0"/>
+          <w:sz w:val="24"/>
+          <w:szCs w:val="24"/>
+          <w:lang w:eastAsia="es-AR"/>
+          <w14:ligatures w14:val="none"/>
+        </w:rPr>
+        <w:t>20 ,</w:t>
+      </w:r>
+      <w:proofErr w:type="gramEnd"/>
+      <w:r>
+        <w:rPr>
+          <w:rFonts w:eastAsia="Times New Roman" w:cstheme="minorHAnsi"/>
+          <w:kern w:val="0"/>
+          <w:sz w:val="24"/>
+          <w:szCs w:val="24"/>
+          <w:lang w:eastAsia="es-AR"/>
+          <w14:ligatures w14:val="none"/>
+        </w:rPr>
+        <w:t xml:space="preserve"> 900)</w:t>
       </w:r>
     </w:p>
     <w:p>
@@ -7036,7 +7225,31 @@
           <w:lang w:eastAsia="es-AR"/>
           <w14:ligatures w14:val="none"/>
         </w:rPr>
-        <w:t>x = (-b ± √(b² - 4ac)) / 2ª</w:t>
+        <w:t xml:space="preserve">x = (-b ± </w:t>
+      </w:r>
+      <w:proofErr w:type="gramStart"/>
+      <w:r>
+        <w:rPr>
+          <w:rFonts w:eastAsia="Times New Roman" w:cstheme="minorHAnsi"/>
+          <w:kern w:val="0"/>
+          <w:sz w:val="24"/>
+          <w:szCs w:val="24"/>
+          <w:lang w:eastAsia="es-AR"/>
+          <w14:ligatures w14:val="none"/>
+        </w:rPr>
+        <w:t>√(</w:t>
+      </w:r>
+      <w:proofErr w:type="gramEnd"/>
+      <w:r>
+        <w:rPr>
+          <w:rFonts w:eastAsia="Times New Roman" w:cstheme="minorHAnsi"/>
+          <w:kern w:val="0"/>
+          <w:sz w:val="24"/>
+          <w:szCs w:val="24"/>
+          <w:lang w:eastAsia="es-AR"/>
+          <w14:ligatures w14:val="none"/>
+        </w:rPr>
+        <w:t>b² - 4ac)) / 2ª</w:t>
       </w:r>
     </w:p>
     <w:p>
@@ -7061,7 +7274,79 @@
           <w:lang w:eastAsia="es-AR"/>
           <w14:ligatures w14:val="none"/>
         </w:rPr>
-        <w:t>x = (−(−40) ± √((−40)² − 4(1)(−50))) / 2(1)</w:t>
+        <w:t xml:space="preserve">x = (−(−40) ± </w:t>
+      </w:r>
+      <w:proofErr w:type="gramStart"/>
+      <w:r>
+        <w:rPr>
+          <w:rFonts w:eastAsia="Times New Roman" w:cstheme="minorHAnsi"/>
+          <w:kern w:val="0"/>
+          <w:sz w:val="24"/>
+          <w:szCs w:val="24"/>
+          <w:lang w:eastAsia="es-AR"/>
+          <w14:ligatures w14:val="none"/>
+        </w:rPr>
+        <w:t>√(</w:t>
+      </w:r>
+      <w:proofErr w:type="gramEnd"/>
+      <w:r>
+        <w:rPr>
+          <w:rFonts w:eastAsia="Times New Roman" w:cstheme="minorHAnsi"/>
+          <w:kern w:val="0"/>
+          <w:sz w:val="24"/>
+          <w:szCs w:val="24"/>
+          <w:lang w:eastAsia="es-AR"/>
+          <w14:ligatures w14:val="none"/>
+        </w:rPr>
+        <w:t>(−</w:t>
+      </w:r>
+      <w:proofErr w:type="gramStart"/>
+      <w:r>
+        <w:rPr>
+          <w:rFonts w:eastAsia="Times New Roman" w:cstheme="minorHAnsi"/>
+          <w:kern w:val="0"/>
+          <w:sz w:val="24"/>
+          <w:szCs w:val="24"/>
+          <w:lang w:eastAsia="es-AR"/>
+          <w14:ligatures w14:val="none"/>
+        </w:rPr>
+        <w:t>40)²</w:t>
+      </w:r>
+      <w:proofErr w:type="gramEnd"/>
+      <w:r>
+        <w:rPr>
+          <w:rFonts w:eastAsia="Times New Roman" w:cstheme="minorHAnsi"/>
+          <w:kern w:val="0"/>
+          <w:sz w:val="24"/>
+          <w:szCs w:val="24"/>
+          <w:lang w:eastAsia="es-AR"/>
+          <w14:ligatures w14:val="none"/>
+        </w:rPr>
+        <w:t xml:space="preserve"> − 4(</w:t>
+      </w:r>
+      <w:proofErr w:type="gramStart"/>
+      <w:r>
+        <w:rPr>
+          <w:rFonts w:eastAsia="Times New Roman" w:cstheme="minorHAnsi"/>
+          <w:kern w:val="0"/>
+          <w:sz w:val="24"/>
+          <w:szCs w:val="24"/>
+          <w:lang w:eastAsia="es-AR"/>
+          <w14:ligatures w14:val="none"/>
+        </w:rPr>
+        <w:t>1)(</w:t>
+      </w:r>
+      <w:proofErr w:type="gramEnd"/>
+      <w:r>
+        <w:rPr>
+          <w:rFonts w:eastAsia="Times New Roman" w:cstheme="minorHAnsi"/>
+          <w:kern w:val="0"/>
+          <w:sz w:val="24"/>
+          <w:szCs w:val="24"/>
+          <w:lang w:eastAsia="es-AR"/>
+          <w14:ligatures w14:val="none"/>
+        </w:rPr>
+        <w:t>−50))) / 2(1)</w:t>
       </w:r>
     </w:p>
     <w:p>
@@ -7086,7 +7371,31 @@
           <w:lang w:eastAsia="es-AR"/>
           <w14:ligatures w14:val="none"/>
         </w:rPr>
-        <w:t>x = (40 ± √(1600 + 200)) / 2</w:t>
+        <w:t xml:space="preserve">x = (40 ± </w:t>
+      </w:r>
+      <w:proofErr w:type="gramStart"/>
+      <w:r>
+        <w:rPr>
+          <w:rFonts w:eastAsia="Times New Roman" w:cstheme="minorHAnsi"/>
+          <w:kern w:val="0"/>
+          <w:sz w:val="24"/>
+          <w:szCs w:val="24"/>
+          <w:lang w:eastAsia="es-AR"/>
+          <w14:ligatures w14:val="none"/>
+        </w:rPr>
+        <w:t>√(</w:t>
+      </w:r>
+      <w:proofErr w:type="gramEnd"/>
+      <w:r>
+        <w:rPr>
+          <w:rFonts w:eastAsia="Times New Roman" w:cstheme="minorHAnsi"/>
+          <w:kern w:val="0"/>
+          <w:sz w:val="24"/>
+          <w:szCs w:val="24"/>
+          <w:lang w:eastAsia="es-AR"/>
+          <w14:ligatures w14:val="none"/>
+        </w:rPr>
+        <w:t>1600 + 200)) / 2</w:t>
       </w:r>
     </w:p>
     <w:p>
@@ -7684,6 +7993,7 @@
         <w:t xml:space="preserve">Después con </w:t>
       </w:r>
       <w:proofErr w:type="spellStart"/>
+      <w:proofErr w:type="gramStart"/>
       <w:r>
         <w:rPr>
           <w:rFonts w:eastAsia="Times New Roman" w:cstheme="minorHAnsi"/>
@@ -7705,7 +8015,19 @@
           <w:lang w:eastAsia="es-AR"/>
           <w14:ligatures w14:val="none"/>
         </w:rPr>
-        <w:t>() mostramos los resultados en pantalla para comparar los tres</w:t>
+        <w:t>(</w:t>
+      </w:r>
+      <w:proofErr w:type="gramEnd"/>
+      <w:r>
+        <w:rPr>
+          <w:rFonts w:eastAsia="Times New Roman" w:cstheme="minorHAnsi"/>
+          <w:kern w:val="0"/>
+          <w:sz w:val="24"/>
+          <w:szCs w:val="24"/>
+          <w:lang w:eastAsia="es-AR"/>
+          <w14:ligatures w14:val="none"/>
+        </w:rPr>
+        <w:t>) mostramos los resultados en pantalla para comparar los tres</w:t>
       </w:r>
       <w:r>
         <w:rPr>
@@ -9781,7 +10103,31 @@
           <w:lang w:eastAsia="es-AR"/>
           <w14:ligatures w14:val="none"/>
         </w:rPr>
-        <w:t>B =70(20)+50</w:t>
+        <w:t>B =70(</w:t>
+      </w:r>
+      <w:proofErr w:type="gramStart"/>
+      <w:r>
+        <w:rPr>
+          <w:rFonts w:eastAsia="Times New Roman" w:cstheme="minorHAnsi"/>
+          <w:kern w:val="0"/>
+          <w:sz w:val="24"/>
+          <w:szCs w:val="24"/>
+          <w:lang w:eastAsia="es-AR"/>
+          <w14:ligatures w14:val="none"/>
+        </w:rPr>
+        <w:t>20)+</w:t>
+      </w:r>
+      <w:proofErr w:type="gramEnd"/>
+      <w:r>
+        <w:rPr>
+          <w:rFonts w:eastAsia="Times New Roman" w:cstheme="minorHAnsi"/>
+          <w:kern w:val="0"/>
+          <w:sz w:val="24"/>
+          <w:szCs w:val="24"/>
+          <w:lang w:eastAsia="es-AR"/>
+          <w14:ligatures w14:val="none"/>
+        </w:rPr>
+        <w:t>50</w:t>
       </w:r>
     </w:p>
     <w:p>
@@ -9866,7 +10212,31 @@
           <w:lang w:eastAsia="es-AR"/>
           <w14:ligatures w14:val="none"/>
         </w:rPr>
-        <w:t>C =−2(20)2+80(20)+100</w:t>
+        <w:t>C =−2(20)2+80(</w:t>
+      </w:r>
+      <w:proofErr w:type="gramStart"/>
+      <w:r>
+        <w:rPr>
+          <w:rFonts w:eastAsia="Times New Roman" w:cstheme="minorHAnsi"/>
+          <w:kern w:val="0"/>
+          <w:sz w:val="24"/>
+          <w:szCs w:val="24"/>
+          <w:lang w:eastAsia="es-AR"/>
+          <w14:ligatures w14:val="none"/>
+        </w:rPr>
+        <w:t>20)+</w:t>
+      </w:r>
+      <w:proofErr w:type="gramEnd"/>
+      <w:r>
+        <w:rPr>
+          <w:rFonts w:eastAsia="Times New Roman" w:cstheme="minorHAnsi"/>
+          <w:kern w:val="0"/>
+          <w:sz w:val="24"/>
+          <w:szCs w:val="24"/>
+          <w:lang w:eastAsia="es-AR"/>
+          <w14:ligatures w14:val="none"/>
+        </w:rPr>
+        <w:t>100</w:t>
       </w:r>
     </w:p>
     <w:p>
@@ -10238,16 +10608,29 @@
           <w14:ligatures w14:val="none"/>
         </w:rPr>
       </w:pPr>
-      <w:r>
-        <w:rPr>
-          <w:rFonts w:eastAsia="Times New Roman" w:cstheme="minorHAnsi"/>
-          <w:kern w:val="0"/>
-          <w:sz w:val="24"/>
-          <w:szCs w:val="24"/>
-          <w:lang w:eastAsia="es-AR"/>
-          <w14:ligatures w14:val="none"/>
-        </w:rPr>
-        <w:t>A(10)=600</w:t>
+      <w:proofErr w:type="gramStart"/>
+      <w:r>
+        <w:rPr>
+          <w:rFonts w:eastAsia="Times New Roman" w:cstheme="minorHAnsi"/>
+          <w:kern w:val="0"/>
+          <w:sz w:val="24"/>
+          <w:szCs w:val="24"/>
+          <w:lang w:eastAsia="es-AR"/>
+          <w14:ligatures w14:val="none"/>
+        </w:rPr>
+        <w:t>A(10)=</w:t>
+      </w:r>
+      <w:proofErr w:type="gramEnd"/>
+      <w:r>
+        <w:rPr>
+          <w:rFonts w:eastAsia="Times New Roman" w:cstheme="minorHAnsi"/>
+          <w:kern w:val="0"/>
+          <w:sz w:val="24"/>
+          <w:szCs w:val="24"/>
+          <w:lang w:eastAsia="es-AR"/>
+          <w14:ligatures w14:val="none"/>
+        </w:rPr>
+        <w:t>600</w:t>
       </w:r>
     </w:p>
     <w:p>
@@ -10265,16 +10648,29 @@
           <w14:ligatures w14:val="none"/>
         </w:rPr>
       </w:pPr>
-      <w:r>
-        <w:rPr>
-          <w:rFonts w:eastAsia="Times New Roman" w:cstheme="minorHAnsi"/>
-          <w:kern w:val="0"/>
-          <w:sz w:val="24"/>
-          <w:szCs w:val="24"/>
-          <w:lang w:eastAsia="es-AR"/>
-          <w14:ligatures w14:val="none"/>
-        </w:rPr>
-        <w:t>B(10)=750</w:t>
+      <w:proofErr w:type="gramStart"/>
+      <w:r>
+        <w:rPr>
+          <w:rFonts w:eastAsia="Times New Roman" w:cstheme="minorHAnsi"/>
+          <w:kern w:val="0"/>
+          <w:sz w:val="24"/>
+          <w:szCs w:val="24"/>
+          <w:lang w:eastAsia="es-AR"/>
+          <w14:ligatures w14:val="none"/>
+        </w:rPr>
+        <w:t>B(10)=</w:t>
+      </w:r>
+      <w:proofErr w:type="gramEnd"/>
+      <w:r>
+        <w:rPr>
+          <w:rFonts w:eastAsia="Times New Roman" w:cstheme="minorHAnsi"/>
+          <w:kern w:val="0"/>
+          <w:sz w:val="24"/>
+          <w:szCs w:val="24"/>
+          <w:lang w:eastAsia="es-AR"/>
+          <w14:ligatures w14:val="none"/>
+        </w:rPr>
+        <w:t>750</w:t>
       </w:r>
     </w:p>
     <w:p>
@@ -10292,16 +10688,29 @@
           <w14:ligatures w14:val="none"/>
         </w:rPr>
       </w:pPr>
-      <w:r>
-        <w:rPr>
-          <w:rFonts w:eastAsia="Times New Roman" w:cstheme="minorHAnsi"/>
-          <w:kern w:val="0"/>
-          <w:sz w:val="24"/>
-          <w:szCs w:val="24"/>
-          <w:lang w:eastAsia="es-AR"/>
-          <w14:ligatures w14:val="none"/>
-        </w:rPr>
-        <w:t>C(10)=700</w:t>
+      <w:proofErr w:type="gramStart"/>
+      <w:r>
+        <w:rPr>
+          <w:rFonts w:eastAsia="Times New Roman" w:cstheme="minorHAnsi"/>
+          <w:kern w:val="0"/>
+          <w:sz w:val="24"/>
+          <w:szCs w:val="24"/>
+          <w:lang w:eastAsia="es-AR"/>
+          <w14:ligatures w14:val="none"/>
+        </w:rPr>
+        <w:t>C(10)=</w:t>
+      </w:r>
+      <w:proofErr w:type="gramEnd"/>
+      <w:r>
+        <w:rPr>
+          <w:rFonts w:eastAsia="Times New Roman" w:cstheme="minorHAnsi"/>
+          <w:kern w:val="0"/>
+          <w:sz w:val="24"/>
+          <w:szCs w:val="24"/>
+          <w:lang w:eastAsia="es-AR"/>
+          <w14:ligatures w14:val="none"/>
+        </w:rPr>
+        <w:t>700</w:t>
       </w:r>
     </w:p>
     <w:p>
@@ -10440,7 +10849,55 @@
           <w:lang w:eastAsia="es-AR"/>
           <w14:ligatures w14:val="none"/>
         </w:rPr>
-        <w:t>B (0) =50 es menor que A (0)=200 y C(0) =100</w:t>
+        <w:t>B (0) =50 es menor que A (</w:t>
+      </w:r>
+      <w:proofErr w:type="gramStart"/>
+      <w:r>
+        <w:rPr>
+          <w:rFonts w:eastAsia="Times New Roman" w:cstheme="minorHAnsi"/>
+          <w:kern w:val="0"/>
+          <w:sz w:val="24"/>
+          <w:szCs w:val="24"/>
+          <w:lang w:eastAsia="es-AR"/>
+          <w14:ligatures w14:val="none"/>
+        </w:rPr>
+        <w:t>0)=</w:t>
+      </w:r>
+      <w:proofErr w:type="gramEnd"/>
+      <w:r>
+        <w:rPr>
+          <w:rFonts w:eastAsia="Times New Roman" w:cstheme="minorHAnsi"/>
+          <w:kern w:val="0"/>
+          <w:sz w:val="24"/>
+          <w:szCs w:val="24"/>
+          <w:lang w:eastAsia="es-AR"/>
+          <w14:ligatures w14:val="none"/>
+        </w:rPr>
+        <w:t xml:space="preserve">200 y </w:t>
+      </w:r>
+      <w:proofErr w:type="gramStart"/>
+      <w:r>
+        <w:rPr>
+          <w:rFonts w:eastAsia="Times New Roman" w:cstheme="minorHAnsi"/>
+          <w:kern w:val="0"/>
+          <w:sz w:val="24"/>
+          <w:szCs w:val="24"/>
+          <w:lang w:eastAsia="es-AR"/>
+          <w14:ligatures w14:val="none"/>
+        </w:rPr>
+        <w:t>C(</w:t>
+      </w:r>
+      <w:proofErr w:type="gramEnd"/>
+      <w:r>
+        <w:rPr>
+          <w:rFonts w:eastAsia="Times New Roman" w:cstheme="minorHAnsi"/>
+          <w:kern w:val="0"/>
+          <w:sz w:val="24"/>
+          <w:szCs w:val="24"/>
+          <w:lang w:eastAsia="es-AR"/>
+          <w14:ligatures w14:val="none"/>
+        </w:rPr>
+        <w:t>0) =100</w:t>
       </w:r>
     </w:p>
     <w:p>
@@ -10570,16 +11027,29 @@
           <w14:ligatures w14:val="none"/>
         </w:rPr>
       </w:pPr>
-      <w:r>
-        <w:rPr>
-          <w:rFonts w:eastAsia="Times New Roman" w:cstheme="minorHAnsi"/>
-          <w:kern w:val="0"/>
-          <w:sz w:val="24"/>
-          <w:szCs w:val="24"/>
-          <w:lang w:eastAsia="es-AR"/>
-          <w14:ligatures w14:val="none"/>
-        </w:rPr>
-        <w:t>A(30)=1400</w:t>
+      <w:proofErr w:type="gramStart"/>
+      <w:r>
+        <w:rPr>
+          <w:rFonts w:eastAsia="Times New Roman" w:cstheme="minorHAnsi"/>
+          <w:kern w:val="0"/>
+          <w:sz w:val="24"/>
+          <w:szCs w:val="24"/>
+          <w:lang w:eastAsia="es-AR"/>
+          <w14:ligatures w14:val="none"/>
+        </w:rPr>
+        <w:t>A(30)=</w:t>
+      </w:r>
+      <w:proofErr w:type="gramEnd"/>
+      <w:r>
+        <w:rPr>
+          <w:rFonts w:eastAsia="Times New Roman" w:cstheme="minorHAnsi"/>
+          <w:kern w:val="0"/>
+          <w:sz w:val="24"/>
+          <w:szCs w:val="24"/>
+          <w:lang w:eastAsia="es-AR"/>
+          <w14:ligatures w14:val="none"/>
+        </w:rPr>
+        <w:t>1400</w:t>
       </w:r>
     </w:p>
     <w:p>
@@ -10597,16 +11067,29 @@
           <w14:ligatures w14:val="none"/>
         </w:rPr>
       </w:pPr>
-      <w:r>
-        <w:rPr>
-          <w:rFonts w:eastAsia="Times New Roman" w:cstheme="minorHAnsi"/>
-          <w:kern w:val="0"/>
-          <w:sz w:val="24"/>
-          <w:szCs w:val="24"/>
-          <w:lang w:eastAsia="es-AR"/>
-          <w14:ligatures w14:val="none"/>
-        </w:rPr>
-        <w:t>B(30)=2150</w:t>
+      <w:proofErr w:type="gramStart"/>
+      <w:r>
+        <w:rPr>
+          <w:rFonts w:eastAsia="Times New Roman" w:cstheme="minorHAnsi"/>
+          <w:kern w:val="0"/>
+          <w:sz w:val="24"/>
+          <w:szCs w:val="24"/>
+          <w:lang w:eastAsia="es-AR"/>
+          <w14:ligatures w14:val="none"/>
+        </w:rPr>
+        <w:t>B(30)=</w:t>
+      </w:r>
+      <w:proofErr w:type="gramEnd"/>
+      <w:r>
+        <w:rPr>
+          <w:rFonts w:eastAsia="Times New Roman" w:cstheme="minorHAnsi"/>
+          <w:kern w:val="0"/>
+          <w:sz w:val="24"/>
+          <w:szCs w:val="24"/>
+          <w:lang w:eastAsia="es-AR"/>
+          <w14:ligatures w14:val="none"/>
+        </w:rPr>
+        <w:t>2150</w:t>
       </w:r>
     </w:p>
     <w:p>
@@ -10624,16 +11107,29 @@
           <w14:ligatures w14:val="none"/>
         </w:rPr>
       </w:pPr>
-      <w:r>
-        <w:rPr>
-          <w:rFonts w:eastAsia="Times New Roman" w:cstheme="minorHAnsi"/>
-          <w:kern w:val="0"/>
-          <w:sz w:val="24"/>
-          <w:szCs w:val="24"/>
-          <w:lang w:eastAsia="es-AR"/>
-          <w14:ligatures w14:val="none"/>
-        </w:rPr>
-        <w:t>C(30)=700</w:t>
+      <w:proofErr w:type="gramStart"/>
+      <w:r>
+        <w:rPr>
+          <w:rFonts w:eastAsia="Times New Roman" w:cstheme="minorHAnsi"/>
+          <w:kern w:val="0"/>
+          <w:sz w:val="24"/>
+          <w:szCs w:val="24"/>
+          <w:lang w:eastAsia="es-AR"/>
+          <w14:ligatures w14:val="none"/>
+        </w:rPr>
+        <w:t>C(30)=</w:t>
+      </w:r>
+      <w:proofErr w:type="gramEnd"/>
+      <w:r>
+        <w:rPr>
+          <w:rFonts w:eastAsia="Times New Roman" w:cstheme="minorHAnsi"/>
+          <w:kern w:val="0"/>
+          <w:sz w:val="24"/>
+          <w:szCs w:val="24"/>
+          <w:lang w:eastAsia="es-AR"/>
+          <w14:ligatures w14:val="none"/>
+        </w:rPr>
+        <w:t>700</w:t>
       </w:r>
     </w:p>
     <w:p>
@@ -10691,33 +11187,474 @@
           <w:lang w:eastAsia="es-AR"/>
           <w14:ligatures w14:val="none"/>
         </w:rPr>
-        <w:t>Para encontrar cuándo el costo es negativo se buscan las raíces</w:t>
-      </w:r>
-      <w:r>
+        <w:t>Para encontrar cuándo el costo es negativo se buscan las raíces de la función.</w:t>
+      </w:r>
+    </w:p>
+    <w:p>
+      <w:pPr>
+        <w:tabs>
+          <w:tab w:val="left" w:pos="1395"/>
+        </w:tabs>
+        <w:spacing w:before="100" w:beforeAutospacing="1" w:after="100" w:afterAutospacing="1" w:line="240" w:lineRule="auto"/>
+        <w:rPr>
+          <w:rFonts w:eastAsia="Times New Roman" w:cstheme="minorHAnsi"/>
+          <w:kern w:val="0"/>
+          <w:sz w:val="24"/>
+          <w:szCs w:val="24"/>
+          <w:lang w:eastAsia="es-AR"/>
+          <w14:ligatures w14:val="none"/>
+        </w:rPr>
+      </w:pPr>
+      <w:r>
+        <w:rPr>
+          <w:rFonts w:eastAsia="Times New Roman" w:cstheme="minorHAnsi"/>
+          <w:kern w:val="0"/>
+          <w:sz w:val="24"/>
+          <w:szCs w:val="24"/>
+          <w:lang w:eastAsia="es-AR"/>
+          <w14:ligatures w14:val="none"/>
+        </w:rPr>
+        <w:t>C(x)&lt;0 cuando:</w:t>
+      </w:r>
+    </w:p>
+    <w:p>
+      <w:pPr>
+        <w:tabs>
+          <w:tab w:val="left" w:pos="1395"/>
+        </w:tabs>
+        <w:spacing w:before="100" w:beforeAutospacing="1" w:after="100" w:afterAutospacing="1" w:line="240" w:lineRule="auto"/>
+        <w:rPr>
+          <w:rFonts w:eastAsia="Times New Roman" w:cstheme="minorHAnsi"/>
+          <w:kern w:val="0"/>
+          <w:sz w:val="24"/>
+          <w:szCs w:val="24"/>
+          <w:lang w:eastAsia="es-AR"/>
+          <w14:ligatures w14:val="none"/>
+        </w:rPr>
+      </w:pPr>
+      <w:r>
+        <w:rPr>
+          <w:rFonts w:eastAsia="Times New Roman" w:cstheme="minorHAnsi"/>
+          <w:kern w:val="0"/>
+          <w:sz w:val="24"/>
+          <w:szCs w:val="24"/>
+          <w:lang w:eastAsia="es-AR"/>
+          <w14:ligatures w14:val="none"/>
+        </w:rPr>
+        <w:t>x&lt;−1,21</w:t>
+      </w:r>
+    </w:p>
+    <w:p>
+      <w:pPr>
+        <w:tabs>
+          <w:tab w:val="left" w:pos="1395"/>
+        </w:tabs>
+        <w:spacing w:before="100" w:beforeAutospacing="1" w:after="100" w:afterAutospacing="1" w:line="240" w:lineRule="auto"/>
+        <w:rPr>
+          <w:rFonts w:eastAsia="Times New Roman" w:cstheme="minorHAnsi"/>
+          <w:kern w:val="0"/>
+          <w:sz w:val="24"/>
+          <w:szCs w:val="24"/>
+          <w:lang w:eastAsia="es-AR"/>
+          <w14:ligatures w14:val="none"/>
+        </w:rPr>
+      </w:pPr>
+      <w:r>
+        <w:rPr>
+          <w:rFonts w:eastAsia="Times New Roman" w:cstheme="minorHAnsi"/>
+          <w:kern w:val="0"/>
+          <w:sz w:val="24"/>
+          <w:szCs w:val="24"/>
+          <w:lang w:eastAsia="es-AR"/>
+          <w14:ligatures w14:val="none"/>
+        </w:rPr>
+        <w:t>o</w:t>
+      </w:r>
+    </w:p>
+    <w:p>
+      <w:pPr>
+        <w:tabs>
+          <w:tab w:val="left" w:pos="1395"/>
+        </w:tabs>
+        <w:spacing w:before="100" w:beforeAutospacing="1" w:after="100" w:afterAutospacing="1" w:line="240" w:lineRule="auto"/>
+        <w:rPr>
+          <w:rFonts w:eastAsia="Times New Roman" w:cstheme="minorHAnsi"/>
+          <w:kern w:val="0"/>
+          <w:sz w:val="24"/>
+          <w:szCs w:val="24"/>
+          <w:lang w:eastAsia="es-AR"/>
+          <w14:ligatures w14:val="none"/>
+        </w:rPr>
+      </w:pPr>
+      <w:r>
+        <w:rPr>
+          <w:rFonts w:eastAsia="Times New Roman" w:cstheme="minorHAnsi"/>
+          <w:kern w:val="0"/>
+          <w:sz w:val="24"/>
+          <w:szCs w:val="24"/>
+          <w:lang w:eastAsia="es-AR"/>
+          <w14:ligatures w14:val="none"/>
+        </w:rPr>
+        <w:t>x&gt;41,21</w:t>
+      </w:r>
+    </w:p>
+    <w:p>
+      <w:pPr>
+        <w:tabs>
+          <w:tab w:val="left" w:pos="1395"/>
+        </w:tabs>
+        <w:spacing w:before="100" w:beforeAutospacing="1" w:after="100" w:afterAutospacing="1" w:line="240" w:lineRule="auto"/>
+        <w:rPr>
+          <w:rFonts w:eastAsia="Times New Roman" w:cstheme="minorHAnsi"/>
+          <w:kern w:val="0"/>
+          <w:sz w:val="24"/>
+          <w:szCs w:val="24"/>
+          <w:lang w:eastAsia="es-AR"/>
+          <w14:ligatures w14:val="none"/>
+        </w:rPr>
+      </w:pPr>
+      <w:r>
+        <w:rPr>
+          <w:rFonts w:eastAsia="Times New Roman" w:cstheme="minorHAnsi"/>
+          <w:kern w:val="0"/>
+          <w:sz w:val="24"/>
+          <w:szCs w:val="24"/>
+          <w:lang w:eastAsia="es-AR"/>
+          <w14:ligatures w14:val="none"/>
+        </w:rPr>
+        <w:lastRenderedPageBreak/>
+        <w:t>Por ejemplo:</w:t>
+      </w:r>
+    </w:p>
+    <w:p>
+      <w:pPr>
+        <w:tabs>
+          <w:tab w:val="left" w:pos="1395"/>
+        </w:tabs>
+        <w:spacing w:before="100" w:beforeAutospacing="1" w:after="100" w:afterAutospacing="1" w:line="240" w:lineRule="auto"/>
+        <w:rPr>
+          <w:rFonts w:eastAsia="Times New Roman" w:cstheme="minorHAnsi"/>
+          <w:kern w:val="0"/>
+          <w:sz w:val="24"/>
+          <w:szCs w:val="24"/>
+          <w:lang w:eastAsia="es-AR"/>
+          <w14:ligatures w14:val="none"/>
+        </w:rPr>
+      </w:pPr>
+      <w:r>
+        <w:rPr>
+          <w:rFonts w:eastAsia="Times New Roman" w:cstheme="minorHAnsi"/>
+          <w:kern w:val="0"/>
+          <w:sz w:val="24"/>
+          <w:szCs w:val="24"/>
+          <w:lang w:eastAsia="es-AR"/>
+          <w14:ligatures w14:val="none"/>
+        </w:rPr>
+        <w:t>x=50</w:t>
+      </w:r>
+    </w:p>
+    <w:p>
+      <w:pPr>
+        <w:tabs>
+          <w:tab w:val="left" w:pos="1395"/>
+        </w:tabs>
+        <w:spacing w:before="100" w:beforeAutospacing="1" w:after="100" w:afterAutospacing="1" w:line="240" w:lineRule="auto"/>
+        <w:rPr>
+          <w:rFonts w:eastAsia="Times New Roman" w:cstheme="minorHAnsi"/>
+          <w:kern w:val="0"/>
+          <w:sz w:val="24"/>
+          <w:szCs w:val="24"/>
+          <w:lang w:eastAsia="es-AR"/>
+          <w14:ligatures w14:val="none"/>
+        </w:rPr>
+      </w:pPr>
+      <w:r>
+        <w:rPr>
+          <w:rFonts w:eastAsia="Times New Roman" w:cstheme="minorHAnsi"/>
+          <w:kern w:val="0"/>
+          <w:sz w:val="24"/>
+          <w:szCs w:val="24"/>
+          <w:lang w:eastAsia="es-AR"/>
+          <w14:ligatures w14:val="none"/>
+        </w:rPr>
+        <w:t>C =−2(50</w:t>
+      </w:r>
+      <w:proofErr w:type="gramStart"/>
+      <w:r>
+        <w:rPr>
+          <w:rFonts w:eastAsia="Times New Roman" w:cstheme="minorHAnsi"/>
+          <w:kern w:val="0"/>
+          <w:sz w:val="24"/>
+          <w:szCs w:val="24"/>
+          <w:lang w:eastAsia="es-AR"/>
+          <w14:ligatures w14:val="none"/>
+        </w:rPr>
+        <w:t>²)+</w:t>
+      </w:r>
+      <w:proofErr w:type="gramEnd"/>
+      <w:r>
+        <w:rPr>
+          <w:rFonts w:eastAsia="Times New Roman" w:cstheme="minorHAnsi"/>
+          <w:kern w:val="0"/>
+          <w:sz w:val="24"/>
+          <w:szCs w:val="24"/>
+          <w:lang w:eastAsia="es-AR"/>
+          <w14:ligatures w14:val="none"/>
+        </w:rPr>
+        <w:t>80(</w:t>
+      </w:r>
+      <w:proofErr w:type="gramStart"/>
+      <w:r>
+        <w:rPr>
+          <w:rFonts w:eastAsia="Times New Roman" w:cstheme="minorHAnsi"/>
+          <w:kern w:val="0"/>
+          <w:sz w:val="24"/>
+          <w:szCs w:val="24"/>
+          <w:lang w:eastAsia="es-AR"/>
+          <w14:ligatures w14:val="none"/>
+        </w:rPr>
+        <w:t>50)+</w:t>
+      </w:r>
+      <w:proofErr w:type="gramEnd"/>
+      <w:r>
+        <w:rPr>
+          <w:rFonts w:eastAsia="Times New Roman" w:cstheme="minorHAnsi"/>
+          <w:kern w:val="0"/>
+          <w:sz w:val="24"/>
+          <w:szCs w:val="24"/>
+          <w:lang w:eastAsia="es-AR"/>
+          <w14:ligatures w14:val="none"/>
+        </w:rPr>
+        <w:t>100</w:t>
+      </w:r>
+    </w:p>
+    <w:p>
+      <w:pPr>
+        <w:tabs>
+          <w:tab w:val="left" w:pos="1395"/>
+        </w:tabs>
+        <w:spacing w:before="100" w:beforeAutospacing="1" w:after="100" w:afterAutospacing="1" w:line="240" w:lineRule="auto"/>
+        <w:rPr>
+          <w:rFonts w:eastAsia="Times New Roman" w:cstheme="minorHAnsi"/>
+          <w:kern w:val="0"/>
+          <w:sz w:val="24"/>
+          <w:szCs w:val="24"/>
+          <w:lang w:eastAsia="es-AR"/>
+          <w14:ligatures w14:val="none"/>
+        </w:rPr>
+      </w:pPr>
+      <w:r>
+        <w:rPr>
+          <w:rFonts w:eastAsia="Times New Roman" w:cstheme="minorHAnsi"/>
+          <w:kern w:val="0"/>
+          <w:sz w:val="24"/>
+          <w:szCs w:val="24"/>
+          <w:lang w:eastAsia="es-AR"/>
+          <w14:ligatures w14:val="none"/>
+        </w:rPr>
+        <w:t>C =−2(</w:t>
+      </w:r>
+      <w:proofErr w:type="gramStart"/>
+      <w:r>
+        <w:rPr>
+          <w:rFonts w:eastAsia="Times New Roman" w:cstheme="minorHAnsi"/>
+          <w:kern w:val="0"/>
+          <w:sz w:val="24"/>
+          <w:szCs w:val="24"/>
+          <w:lang w:eastAsia="es-AR"/>
+          <w14:ligatures w14:val="none"/>
+        </w:rPr>
+        <w:t>2500)+</w:t>
+      </w:r>
+      <w:proofErr w:type="gramEnd"/>
+      <w:r>
+        <w:rPr>
+          <w:rFonts w:eastAsia="Times New Roman" w:cstheme="minorHAnsi"/>
+          <w:kern w:val="0"/>
+          <w:sz w:val="24"/>
+          <w:szCs w:val="24"/>
+          <w:lang w:eastAsia="es-AR"/>
+          <w14:ligatures w14:val="none"/>
+        </w:rPr>
+        <w:t>4000+100</w:t>
+      </w:r>
+    </w:p>
+    <w:p>
+      <w:pPr>
+        <w:tabs>
+          <w:tab w:val="left" w:pos="1395"/>
+        </w:tabs>
+        <w:spacing w:before="100" w:beforeAutospacing="1" w:after="100" w:afterAutospacing="1" w:line="240" w:lineRule="auto"/>
+        <w:rPr>
+          <w:rFonts w:eastAsia="Times New Roman" w:cstheme="minorHAnsi"/>
+          <w:kern w:val="0"/>
+          <w:sz w:val="24"/>
+          <w:szCs w:val="24"/>
+          <w:lang w:eastAsia="es-AR"/>
+          <w14:ligatures w14:val="none"/>
+        </w:rPr>
+      </w:pPr>
+      <w:r>
+        <w:rPr>
+          <w:rFonts w:eastAsia="Times New Roman" w:cstheme="minorHAnsi"/>
+          <w:kern w:val="0"/>
+          <w:sz w:val="24"/>
+          <w:szCs w:val="24"/>
+          <w:lang w:eastAsia="es-AR"/>
+          <w14:ligatures w14:val="none"/>
+        </w:rPr>
+        <w:t>C =−5000+4100</w:t>
+      </w:r>
+    </w:p>
+    <w:p>
+      <w:pPr>
+        <w:tabs>
+          <w:tab w:val="left" w:pos="1395"/>
+        </w:tabs>
+        <w:spacing w:before="100" w:beforeAutospacing="1" w:after="100" w:afterAutospacing="1" w:line="240" w:lineRule="auto"/>
+        <w:rPr>
+          <w:rFonts w:eastAsia="Times New Roman" w:cstheme="minorHAnsi"/>
+          <w:kern w:val="0"/>
+          <w:sz w:val="24"/>
+          <w:szCs w:val="24"/>
+          <w:lang w:eastAsia="es-AR"/>
+          <w14:ligatures w14:val="none"/>
+        </w:rPr>
+      </w:pPr>
+      <w:r>
+        <w:rPr>
+          <w:rFonts w:eastAsia="Times New Roman" w:cstheme="minorHAnsi"/>
+          <w:kern w:val="0"/>
+          <w:sz w:val="24"/>
+          <w:szCs w:val="24"/>
+          <w:lang w:eastAsia="es-AR"/>
+          <w14:ligatures w14:val="none"/>
+        </w:rPr>
+        <w:t>C =−900</w:t>
+      </w:r>
+    </w:p>
+    <w:p>
+      <w:pPr>
+        <w:tabs>
+          <w:tab w:val="left" w:pos="1395"/>
+        </w:tabs>
+        <w:spacing w:before="100" w:beforeAutospacing="1" w:after="100" w:afterAutospacing="1" w:line="240" w:lineRule="auto"/>
+        <w:rPr>
+          <w:rFonts w:eastAsia="Times New Roman" w:cstheme="minorHAnsi"/>
+          <w:kern w:val="0"/>
+          <w:sz w:val="24"/>
+          <w:szCs w:val="24"/>
+          <w:lang w:eastAsia="es-AR"/>
+          <w14:ligatures w14:val="none"/>
+        </w:rPr>
+      </w:pPr>
+      <w:r>
+        <w:rPr>
+          <w:rFonts w:eastAsia="Times New Roman" w:cstheme="minorHAnsi"/>
+          <w:kern w:val="0"/>
+          <w:sz w:val="24"/>
+          <w:szCs w:val="24"/>
+          <w:lang w:eastAsia="es-AR"/>
+          <w14:ligatures w14:val="none"/>
+        </w:rPr>
+        <w:t>El costo es negativo.</w:t>
+      </w:r>
+    </w:p>
+    <w:p>
+      <w:pPr>
+        <w:tabs>
+          <w:tab w:val="left" w:pos="1395"/>
+        </w:tabs>
+        <w:spacing w:before="100" w:beforeAutospacing="1" w:after="100" w:afterAutospacing="1" w:line="240" w:lineRule="auto"/>
+        <w:rPr>
+          <w:rFonts w:eastAsia="Times New Roman" w:cstheme="minorHAnsi"/>
+          <w:kern w:val="0"/>
+          <w:sz w:val="24"/>
+          <w:szCs w:val="24"/>
+          <w:lang w:eastAsia="es-AR"/>
+          <w14:ligatures w14:val="none"/>
+        </w:rPr>
+      </w:pPr>
+      <w:r>
+        <w:rPr>
+          <w:rFonts w:eastAsia="Times New Roman" w:cstheme="minorHAnsi"/>
+          <w:kern w:val="0"/>
+          <w:sz w:val="24"/>
+          <w:szCs w:val="24"/>
+          <w:lang w:eastAsia="es-AR"/>
+          <w14:ligatures w14:val="none"/>
+        </w:rPr>
+        <w:t>Esto es un problema real porque un costo negativo no tiene sentido, ya que significarí</w:t>
+      </w:r>
+      <w:r>
+        <w:rPr>
+          <w:rFonts w:eastAsia="Times New Roman" w:cstheme="minorHAnsi"/>
+          <w:kern w:val="0"/>
+          <w:sz w:val="24"/>
+          <w:szCs w:val="24"/>
+          <w:lang w:eastAsia="es-AR"/>
+          <w14:ligatures w14:val="none"/>
+        </w:rPr>
+        <w:t xml:space="preserve">a </w:t>
+      </w:r>
+      <w:r>
+        <w:rPr>
+          <w:rFonts w:eastAsia="Times New Roman" w:cstheme="minorHAnsi"/>
+          <w:kern w:val="0"/>
+          <w:sz w:val="24"/>
+          <w:szCs w:val="24"/>
+          <w:lang w:eastAsia="es-AR"/>
+          <w14:ligatures w14:val="none"/>
+        </w:rPr>
+        <w:t>que la empresa pierde dinero o le paga al cliente.</w:t>
+      </w:r>
+    </w:p>
+    <w:p>
+      <w:pPr>
+        <w:tabs>
+          <w:tab w:val="left" w:pos="1395"/>
+        </w:tabs>
+        <w:spacing w:before="100" w:beforeAutospacing="1" w:after="100" w:afterAutospacing="1" w:line="240" w:lineRule="auto"/>
+        <w:rPr>
+          <w:rFonts w:eastAsia="Times New Roman" w:cstheme="minorHAnsi"/>
+          <w:kern w:val="0"/>
+          <w:sz w:val="24"/>
+          <w:szCs w:val="24"/>
+          <w:lang w:eastAsia="es-AR"/>
+          <w14:ligatures w14:val="none"/>
+        </w:rPr>
+      </w:pPr>
+    </w:p>
+    <w:p>
+      <w:pPr>
+        <w:tabs>
+          <w:tab w:val="left" w:pos="1395"/>
+        </w:tabs>
+        <w:spacing w:before="100" w:beforeAutospacing="1" w:after="100" w:afterAutospacing="1" w:line="240" w:lineRule="auto"/>
+        <w:jc w:val="center"/>
         <w:rPr>
           <w:rFonts w:eastAsia="Times New Roman" w:cstheme="minorHAnsi"/>
           <w:b/>
           <w:bCs/>
           <w:kern w:val="0"/>
-          <w:sz w:val="32"/>
-          <w:szCs w:val="32"/>
-          <w:lang w:eastAsia="es-AR"/>
-          <w14:ligatures w14:val="none"/>
-        </w:rPr>
-        <w:t xml:space="preserve"> </w:t>
-      </w:r>
+          <w:sz w:val="36"/>
+          <w:szCs w:val="36"/>
+          <w:lang w:eastAsia="es-AR"/>
+          <w14:ligatures w14:val="none"/>
+        </w:rPr>
+      </w:pPr>
       <w:r>
         <w:rPr>
           <w:rFonts w:eastAsia="Times New Roman" w:cstheme="minorHAnsi"/>
           <w:b/>
           <w:bCs/>
           <w:kern w:val="0"/>
-          <w:sz w:val="32"/>
-          <w:szCs w:val="32"/>
-          <w:lang w:eastAsia="es-AR"/>
-          <w14:ligatures w14:val="none"/>
-        </w:rPr>
-        <w:t>de la función.</w:t>
+          <w:sz w:val="36"/>
+          <w:szCs w:val="36"/>
+          <w:lang w:eastAsia="es-AR"/>
+          <w14:ligatures w14:val="none"/>
+        </w:rPr>
+        <w:t>Consigna 3 — Análisis de rendimiento en un sistema</w:t>
       </w:r>
     </w:p>
     <w:p>
@@ -10726,345 +11663,30 @@
           <w:tab w:val="left" w:pos="1395"/>
         </w:tabs>
         <w:spacing w:before="100" w:beforeAutospacing="1" w:after="100" w:afterAutospacing="1" w:line="240" w:lineRule="auto"/>
-        <w:rPr>
-          <w:rFonts w:eastAsia="Times New Roman" w:cstheme="minorHAnsi"/>
-          <w:kern w:val="0"/>
-          <w:sz w:val="24"/>
-          <w:szCs w:val="24"/>
-          <w:lang w:eastAsia="es-AR"/>
-          <w14:ligatures w14:val="none"/>
-        </w:rPr>
-      </w:pPr>
-      <w:r>
-        <w:rPr>
-          <w:rFonts w:eastAsia="Times New Roman" w:cstheme="minorHAnsi"/>
-          <w:kern w:val="0"/>
-          <w:sz w:val="24"/>
-          <w:szCs w:val="24"/>
-          <w:lang w:eastAsia="es-AR"/>
-          <w14:ligatures w14:val="none"/>
-        </w:rPr>
-        <w:t>C(x)&lt;0 cuando:</w:t>
-      </w:r>
-    </w:p>
-    <w:p>
-      <w:pPr>
-        <w:tabs>
-          <w:tab w:val="left" w:pos="1395"/>
-        </w:tabs>
-        <w:spacing w:before="100" w:beforeAutospacing="1" w:after="100" w:afterAutospacing="1" w:line="240" w:lineRule="auto"/>
-        <w:rPr>
-          <w:rFonts w:eastAsia="Times New Roman" w:cstheme="minorHAnsi"/>
-          <w:kern w:val="0"/>
-          <w:sz w:val="24"/>
-          <w:szCs w:val="24"/>
-          <w:lang w:eastAsia="es-AR"/>
-          <w14:ligatures w14:val="none"/>
-        </w:rPr>
-      </w:pPr>
-      <w:r>
-        <w:rPr>
-          <w:rFonts w:eastAsia="Times New Roman" w:cstheme="minorHAnsi"/>
-          <w:kern w:val="0"/>
-          <w:sz w:val="24"/>
-          <w:szCs w:val="24"/>
-          <w:lang w:eastAsia="es-AR"/>
-          <w14:ligatures w14:val="none"/>
-        </w:rPr>
-        <w:t>x&lt;−1,21</w:t>
-      </w:r>
-    </w:p>
-    <w:p>
-      <w:pPr>
-        <w:tabs>
-          <w:tab w:val="left" w:pos="1395"/>
-        </w:tabs>
-        <w:spacing w:before="100" w:beforeAutospacing="1" w:after="100" w:afterAutospacing="1" w:line="240" w:lineRule="auto"/>
-        <w:rPr>
-          <w:rFonts w:eastAsia="Times New Roman" w:cstheme="minorHAnsi"/>
-          <w:kern w:val="0"/>
-          <w:sz w:val="24"/>
-          <w:szCs w:val="24"/>
-          <w:lang w:eastAsia="es-AR"/>
-          <w14:ligatures w14:val="none"/>
-        </w:rPr>
-      </w:pPr>
-      <w:r>
-        <w:rPr>
-          <w:rFonts w:eastAsia="Times New Roman" w:cstheme="minorHAnsi"/>
-          <w:kern w:val="0"/>
-          <w:sz w:val="24"/>
-          <w:szCs w:val="24"/>
-          <w:lang w:eastAsia="es-AR"/>
-          <w14:ligatures w14:val="none"/>
-        </w:rPr>
-        <w:t>o</w:t>
-      </w:r>
-    </w:p>
-    <w:p>
-      <w:pPr>
-        <w:tabs>
-          <w:tab w:val="left" w:pos="1395"/>
-        </w:tabs>
-        <w:spacing w:before="100" w:beforeAutospacing="1" w:after="100" w:afterAutospacing="1" w:line="240" w:lineRule="auto"/>
-        <w:rPr>
-          <w:rFonts w:eastAsia="Times New Roman" w:cstheme="minorHAnsi"/>
-          <w:kern w:val="0"/>
-          <w:sz w:val="24"/>
-          <w:szCs w:val="24"/>
-          <w:lang w:eastAsia="es-AR"/>
-          <w14:ligatures w14:val="none"/>
-        </w:rPr>
-      </w:pPr>
-      <w:r>
-        <w:rPr>
-          <w:rFonts w:eastAsia="Times New Roman" w:cstheme="minorHAnsi"/>
-          <w:kern w:val="0"/>
-          <w:sz w:val="24"/>
-          <w:szCs w:val="24"/>
-          <w:lang w:eastAsia="es-AR"/>
-          <w14:ligatures w14:val="none"/>
-        </w:rPr>
-        <w:t>x&gt;41,21</w:t>
-      </w:r>
-    </w:p>
-    <w:p>
-      <w:pPr>
-        <w:tabs>
-          <w:tab w:val="left" w:pos="1395"/>
-        </w:tabs>
-        <w:spacing w:before="100" w:beforeAutospacing="1" w:after="100" w:afterAutospacing="1" w:line="240" w:lineRule="auto"/>
-        <w:rPr>
-          <w:rFonts w:eastAsia="Times New Roman" w:cstheme="minorHAnsi"/>
-          <w:kern w:val="0"/>
-          <w:sz w:val="24"/>
-          <w:szCs w:val="24"/>
-          <w:lang w:eastAsia="es-AR"/>
-          <w14:ligatures w14:val="none"/>
-        </w:rPr>
-      </w:pPr>
-      <w:r>
-        <w:rPr>
-          <w:rFonts w:eastAsia="Times New Roman" w:cstheme="minorHAnsi"/>
-          <w:kern w:val="0"/>
-          <w:sz w:val="24"/>
-          <w:szCs w:val="24"/>
-          <w:lang w:eastAsia="es-AR"/>
-          <w14:ligatures w14:val="none"/>
-        </w:rPr>
-        <w:lastRenderedPageBreak/>
-        <w:t>Por ejemplo:</w:t>
-      </w:r>
-    </w:p>
-    <w:p>
-      <w:pPr>
-        <w:tabs>
-          <w:tab w:val="left" w:pos="1395"/>
-        </w:tabs>
-        <w:spacing w:before="100" w:beforeAutospacing="1" w:after="100" w:afterAutospacing="1" w:line="240" w:lineRule="auto"/>
-        <w:rPr>
-          <w:rFonts w:eastAsia="Times New Roman" w:cstheme="minorHAnsi"/>
-          <w:kern w:val="0"/>
-          <w:sz w:val="24"/>
-          <w:szCs w:val="24"/>
-          <w:lang w:eastAsia="es-AR"/>
-          <w14:ligatures w14:val="none"/>
-        </w:rPr>
-      </w:pPr>
-      <w:r>
-        <w:rPr>
-          <w:rFonts w:eastAsia="Times New Roman" w:cstheme="minorHAnsi"/>
-          <w:kern w:val="0"/>
-          <w:sz w:val="24"/>
-          <w:szCs w:val="24"/>
-          <w:lang w:eastAsia="es-AR"/>
-          <w14:ligatures w14:val="none"/>
-        </w:rPr>
-        <w:t>x=50</w:t>
-      </w:r>
-    </w:p>
-    <w:p>
-      <w:pPr>
-        <w:tabs>
-          <w:tab w:val="left" w:pos="1395"/>
-        </w:tabs>
-        <w:spacing w:before="100" w:beforeAutospacing="1" w:after="100" w:afterAutospacing="1" w:line="240" w:lineRule="auto"/>
-        <w:rPr>
-          <w:rFonts w:eastAsia="Times New Roman" w:cstheme="minorHAnsi"/>
-          <w:kern w:val="0"/>
-          <w:sz w:val="24"/>
-          <w:szCs w:val="24"/>
-          <w:lang w:eastAsia="es-AR"/>
-          <w14:ligatures w14:val="none"/>
-        </w:rPr>
-      </w:pPr>
-      <w:r>
-        <w:rPr>
-          <w:rFonts w:eastAsia="Times New Roman" w:cstheme="minorHAnsi"/>
-          <w:kern w:val="0"/>
-          <w:sz w:val="24"/>
-          <w:szCs w:val="24"/>
-          <w:lang w:eastAsia="es-AR"/>
-          <w14:ligatures w14:val="none"/>
-        </w:rPr>
-        <w:t>C =−2(50²)+80(50)+100</w:t>
-      </w:r>
-    </w:p>
-    <w:p>
-      <w:pPr>
-        <w:tabs>
-          <w:tab w:val="left" w:pos="1395"/>
-        </w:tabs>
-        <w:spacing w:before="100" w:beforeAutospacing="1" w:after="100" w:afterAutospacing="1" w:line="240" w:lineRule="auto"/>
-        <w:rPr>
-          <w:rFonts w:eastAsia="Times New Roman" w:cstheme="minorHAnsi"/>
-          <w:kern w:val="0"/>
-          <w:sz w:val="24"/>
-          <w:szCs w:val="24"/>
-          <w:lang w:eastAsia="es-AR"/>
-          <w14:ligatures w14:val="none"/>
-        </w:rPr>
-      </w:pPr>
-      <w:r>
-        <w:rPr>
-          <w:rFonts w:eastAsia="Times New Roman" w:cstheme="minorHAnsi"/>
-          <w:kern w:val="0"/>
-          <w:sz w:val="24"/>
-          <w:szCs w:val="24"/>
-          <w:lang w:eastAsia="es-AR"/>
-          <w14:ligatures w14:val="none"/>
-        </w:rPr>
-        <w:t>C =−2(2500)+4000+100</w:t>
-      </w:r>
-    </w:p>
-    <w:p>
-      <w:pPr>
-        <w:tabs>
-          <w:tab w:val="left" w:pos="1395"/>
-        </w:tabs>
-        <w:spacing w:before="100" w:beforeAutospacing="1" w:after="100" w:afterAutospacing="1" w:line="240" w:lineRule="auto"/>
-        <w:rPr>
-          <w:rFonts w:eastAsia="Times New Roman" w:cstheme="minorHAnsi"/>
-          <w:kern w:val="0"/>
-          <w:sz w:val="24"/>
-          <w:szCs w:val="24"/>
-          <w:lang w:eastAsia="es-AR"/>
-          <w14:ligatures w14:val="none"/>
-        </w:rPr>
-      </w:pPr>
-      <w:r>
-        <w:rPr>
-          <w:rFonts w:eastAsia="Times New Roman" w:cstheme="minorHAnsi"/>
-          <w:kern w:val="0"/>
-          <w:sz w:val="24"/>
-          <w:szCs w:val="24"/>
-          <w:lang w:eastAsia="es-AR"/>
-          <w14:ligatures w14:val="none"/>
-        </w:rPr>
-        <w:t>C =−5000+4100</w:t>
-      </w:r>
-    </w:p>
-    <w:p>
-      <w:pPr>
-        <w:tabs>
-          <w:tab w:val="left" w:pos="1395"/>
-        </w:tabs>
-        <w:spacing w:before="100" w:beforeAutospacing="1" w:after="100" w:afterAutospacing="1" w:line="240" w:lineRule="auto"/>
-        <w:rPr>
-          <w:rFonts w:eastAsia="Times New Roman" w:cstheme="minorHAnsi"/>
-          <w:kern w:val="0"/>
-          <w:sz w:val="24"/>
-          <w:szCs w:val="24"/>
-          <w:lang w:eastAsia="es-AR"/>
-          <w14:ligatures w14:val="none"/>
-        </w:rPr>
-      </w:pPr>
-      <w:r>
-        <w:rPr>
-          <w:rFonts w:eastAsia="Times New Roman" w:cstheme="minorHAnsi"/>
-          <w:kern w:val="0"/>
-          <w:sz w:val="24"/>
-          <w:szCs w:val="24"/>
-          <w:lang w:eastAsia="es-AR"/>
-          <w14:ligatures w14:val="none"/>
-        </w:rPr>
-        <w:t>C =−900</w:t>
-      </w:r>
-    </w:p>
-    <w:p>
-      <w:pPr>
-        <w:tabs>
-          <w:tab w:val="left" w:pos="1395"/>
-        </w:tabs>
-        <w:spacing w:before="100" w:beforeAutospacing="1" w:after="100" w:afterAutospacing="1" w:line="240" w:lineRule="auto"/>
-        <w:rPr>
-          <w:rFonts w:eastAsia="Times New Roman" w:cstheme="minorHAnsi"/>
-          <w:kern w:val="0"/>
-          <w:sz w:val="24"/>
-          <w:szCs w:val="24"/>
-          <w:lang w:eastAsia="es-AR"/>
-          <w14:ligatures w14:val="none"/>
-        </w:rPr>
-      </w:pPr>
-      <w:r>
-        <w:rPr>
-          <w:rFonts w:eastAsia="Times New Roman" w:cstheme="minorHAnsi"/>
-          <w:kern w:val="0"/>
-          <w:sz w:val="24"/>
-          <w:szCs w:val="24"/>
-          <w:lang w:eastAsia="es-AR"/>
-          <w14:ligatures w14:val="none"/>
-        </w:rPr>
-        <w:t>El costo es negativo.</w:t>
-      </w:r>
-    </w:p>
-    <w:p>
-      <w:pPr>
-        <w:tabs>
-          <w:tab w:val="left" w:pos="1395"/>
-        </w:tabs>
-        <w:spacing w:before="100" w:beforeAutospacing="1" w:after="100" w:afterAutospacing="1" w:line="240" w:lineRule="auto"/>
-        <w:rPr>
-          <w:rFonts w:eastAsia="Times New Roman" w:cstheme="minorHAnsi"/>
-          <w:kern w:val="0"/>
-          <w:sz w:val="24"/>
-          <w:szCs w:val="24"/>
-          <w:lang w:eastAsia="es-AR"/>
-          <w14:ligatures w14:val="none"/>
-        </w:rPr>
-      </w:pPr>
-      <w:r>
-        <w:rPr>
-          <w:rFonts w:eastAsia="Times New Roman" w:cstheme="minorHAnsi"/>
-          <w:kern w:val="0"/>
-          <w:sz w:val="24"/>
-          <w:szCs w:val="24"/>
-          <w:lang w:eastAsia="es-AR"/>
-          <w14:ligatures w14:val="none"/>
-        </w:rPr>
-        <w:t>Esto es un problema real porque un costo negativo no tiene sentido, ya que significarí</w:t>
-      </w:r>
-      <w:r>
-        <w:rPr>
-          <w:rFonts w:eastAsia="Times New Roman" w:cstheme="minorHAnsi"/>
-          <w:kern w:val="0"/>
-          <w:sz w:val="24"/>
-          <w:szCs w:val="24"/>
-          <w:lang w:eastAsia="es-AR"/>
-          <w14:ligatures w14:val="none"/>
-        </w:rPr>
-        <w:t xml:space="preserve">a </w:t>
-      </w:r>
-      <w:r>
-        <w:rPr>
-          <w:rFonts w:eastAsia="Times New Roman" w:cstheme="minorHAnsi"/>
-          <w:kern w:val="0"/>
-          <w:sz w:val="24"/>
-          <w:szCs w:val="24"/>
-          <w:lang w:eastAsia="es-AR"/>
-          <w14:ligatures w14:val="none"/>
-        </w:rPr>
-        <w:t>que la empresa pierde dinero o le paga al cliente.</w:t>
+        <w:jc w:val="center"/>
+        <w:rPr>
+          <w:rFonts w:eastAsia="Times New Roman" w:cstheme="minorHAnsi"/>
+          <w:b/>
+          <w:bCs/>
+          <w:kern w:val="0"/>
+          <w:sz w:val="36"/>
+          <w:szCs w:val="36"/>
+          <w:lang w:eastAsia="es-AR"/>
+          <w14:ligatures w14:val="none"/>
+        </w:rPr>
+      </w:pPr>
+      <w:r>
+        <w:rPr>
+          <w:rFonts w:eastAsia="Times New Roman" w:cstheme="minorHAnsi"/>
+          <w:b/>
+          <w:bCs/>
+          <w:kern w:val="0"/>
+          <w:sz w:val="36"/>
+          <w:szCs w:val="36"/>
+          <w:lang w:eastAsia="es-AR"/>
+          <w14:ligatures w14:val="none"/>
+        </w:rPr>
+        <w:t>distribuido.</w:t>
       </w:r>
     </w:p>
     <w:p>

</xml_diff>